<commit_message>
Repare broken script 14
</commit_message>
<xml_diff>
--- a/R/data/analysis/output/watertype/statistiek_watertype_rapport.docx
+++ b/R/data/analysis/output/watertype/statistiek_watertype_rapport.docx
@@ -15,7 +15,7 @@
         <w:pStyle w:val="Normal"/>
       </w:pPr>
       <w:r>
-        <w:t xml:space="preserve">Gegenereerd op: 2025-12-24</w:t>
+        <w:t xml:space="preserve">Gegenereerd op: 2026-03-11</w:t>
       </w:r>
     </w:p>
     <w:p>
@@ -1369,7 +1369,7 @@
                 <w:szCs w:val="22"/>
                 <w:color w:val="000000"/>
               </w:rPr>
-              <w:t xml:space="preserve">-4.339</w:t>
+              <w:t xml:space="preserve">-4.338</w:t>
             </w:r>
           </w:p>
         </w:tc>
@@ -2305,7 +2305,7 @@
                 <w:szCs w:val="22"/>
                 <w:color w:val="000000"/>
               </w:rPr>
-              <w:t xml:space="preserve">8.645</w:t>
+              <w:t xml:space="preserve">8.647</w:t>
             </w:r>
           </w:p>
         </w:tc>
@@ -2635,7 +2635,7 @@
                 <w:szCs w:val="22"/>
                 <w:color w:val="000000"/>
               </w:rPr>
-              <w:t xml:space="preserve">15.665</w:t>
+              <w:t xml:space="preserve">15.666</w:t>
             </w:r>
           </w:p>
         </w:tc>
@@ -3439,7 +3439,7 @@
                 <w:szCs w:val="22"/>
                 <w:color w:val="000000"/>
               </w:rPr>
-              <w:t xml:space="preserve">58.223</w:t>
+              <w:t xml:space="preserve">58.221</w:t>
             </w:r>
           </w:p>
         </w:tc>
@@ -3661,7 +3661,7 @@
                 <w:szCs w:val="22"/>
                 <w:color w:val="000000"/>
               </w:rPr>
-              <w:t xml:space="preserve">11.853</w:t>
+              <w:t xml:space="preserve">11.852</w:t>
             </w:r>
           </w:p>
         </w:tc>
@@ -3883,7 +3883,7 @@
                 <w:szCs w:val="22"/>
                 <w:color w:val="000000"/>
               </w:rPr>
-              <w:t xml:space="preserve">29.863</w:t>
+              <w:t xml:space="preserve">29.858</w:t>
             </w:r>
           </w:p>
         </w:tc>
@@ -4105,7 +4105,7 @@
                 <w:szCs w:val="22"/>
                 <w:color w:val="000000"/>
               </w:rPr>
-              <w:t xml:space="preserve">26.444</w:t>
+              <w:t xml:space="preserve">26.443</w:t>
             </w:r>
           </w:p>
         </w:tc>

</xml_diff>